<commit_message>
Primer commit 15 de mayo
</commit_message>
<xml_diff>
--- a/word.docx
+++ b/word.docx
@@ -3,26 +3,17 @@
 <w:document xmlns:wpc="http://schemas.microsoft.com/office/word/2010/wordprocessingCanvas" xmlns:cx="http://schemas.microsoft.com/office/drawing/2014/chartex" xmlns:cx1="http://schemas.microsoft.com/office/drawing/2015/9/8/chartex" xmlns:cx2="http://schemas.microsoft.com/office/drawing/2015/10/21/chartex" xmlns:cx3="http://schemas.microsoft.com/office/drawing/2016/5/9/chartex" xmlns:cx4="http://schemas.microsoft.com/office/drawing/2016/5/10/chartex" xmlns:cx5="http://schemas.microsoft.com/office/drawing/2016/5/11/chartex" xmlns:cx6="http://schemas.microsoft.com/office/drawing/2016/5/12/chartex" xmlns:cx7="http://schemas.microsoft.com/office/drawing/2016/5/13/chartex" xmlns:cx8="http://schemas.microsoft.com/office/drawing/2016/5/14/chartex" xmlns:mc="http://schemas.openxmlformats.org/markup-compatibility/2006" xmlns:aink="http://schemas.microsoft.com/office/drawing/2016/ink" xmlns:am3d="http://schemas.microsoft.com/office/drawing/2017/model3d" xmlns:o="urn:schemas-microsoft-com:office:office" xmlns:oel="http://schemas.microsoft.com/office/2019/extlst" xmlns:r="http://schemas.openxmlformats.org/officeDocument/2006/relationships" xmlns:m="http://schemas.openxmlformats.org/officeDocument/2006/math" xmlns:v="urn:schemas-microsoft-com:vml" xmlns:wp14="http://schemas.microsoft.com/office/word/2010/wordprocessingDrawing" xmlns:wp="http://schemas.openxmlformats.org/drawingml/2006/wordprocessingDrawing" xmlns:w10="urn:schemas-microsoft-com:office:word" xmlns:w="http://schemas.openxmlformats.org/wordprocessingml/2006/main" xmlns:w14="http://schemas.microsoft.com/office/word/2010/wordml" xmlns:w15="http://schemas.microsoft.com/office/word/2012/wordml" xmlns:w16cex="http://schemas.microsoft.com/office/word/2018/wordml/cex" xmlns:w16cid="http://schemas.microsoft.com/office/word/2016/wordml/cid" xmlns:w16="http://schemas.microsoft.com/office/word/2018/wordml" xmlns:w16sdtdh="http://schemas.microsoft.com/office/word/2020/wordml/sdtdatahash" xmlns:w16se="http://schemas.microsoft.com/office/word/2015/wordml/symex" xmlns:wpg="http://schemas.microsoft.com/office/word/2010/wordprocessingGroup" xmlns:wpi="http://schemas.microsoft.com/office/word/2010/wordprocessingInk" xmlns:wne="http://schemas.microsoft.com/office/word/2006/wordml" xmlns:wps="http://schemas.microsoft.com/office/word/2010/wordprocessingShape" mc:Ignorable="w14 w15 w16se w16cid w16 w16cex w16sdtdh wp14">
   <w:body>
     <w:p>
-      <w:proofErr w:type="spellStart"/>
       <w:r>
-        <w:t>Secrets</w:t>
-      </w:r>
-      <w:proofErr w:type="spellEnd"/>
-      <w:r>
-        <w:t xml:space="preserve"> de Docker Hub</w:t>
+        <w:t>Docker file y build correcto</w:t>
       </w:r>
     </w:p>
-    <w:p/>
     <w:p>
       <w:r>
-        <w:rPr>
-          <w:noProof/>
-        </w:rPr>
         <w:drawing>
-          <wp:inline distT="0" distB="0" distL="0" distR="0" wp14:anchorId="31E5CC25" wp14:editId="5C12B2CB">
-            <wp:extent cx="6237807" cy="3133725"/>
-            <wp:effectExtent l="0" t="0" r="0" b="0"/>
-            <wp:docPr id="1" name="Imagen 1"/>
+          <wp:inline distT="0" distB="0" distL="0" distR="0" wp14:anchorId="75FC8F1B" wp14:editId="7DB49E49">
+            <wp:extent cx="5612130" cy="3148330"/>
+            <wp:effectExtent l="0" t="0" r="7620" b="0"/>
+            <wp:docPr id="7" name="Imagen 7"/>
             <wp:cNvGraphicFramePr>
               <a:graphicFrameLocks xmlns:a="http://schemas.openxmlformats.org/drawingml/2006/main" noChangeAspect="1"/>
             </wp:cNvGraphicFramePr>
@@ -42,7 +33,7 @@
                   <pic:spPr>
                     <a:xfrm>
                       <a:off x="0" y="0"/>
-                      <a:ext cx="6241326" cy="3135493"/>
+                      <a:ext cx="5612130" cy="3148330"/>
                     </a:xfrm>
                     <a:prstGeom prst="rect">
                       <a:avLst/>
@@ -58,10 +49,10 @@
     <w:p>
       <w:r>
         <w:drawing>
-          <wp:inline distT="0" distB="0" distL="0" distR="0" wp14:anchorId="366CF75F" wp14:editId="29A6E0AF">
-            <wp:extent cx="5612130" cy="2590165"/>
-            <wp:effectExtent l="0" t="0" r="7620" b="635"/>
-            <wp:docPr id="2" name="Imagen 2"/>
+          <wp:inline distT="0" distB="0" distL="0" distR="0" wp14:anchorId="6A87D5A1" wp14:editId="5F98245A">
+            <wp:extent cx="5612130" cy="2854960"/>
+            <wp:effectExtent l="0" t="0" r="7620" b="2540"/>
+            <wp:docPr id="8" name="Imagen 8"/>
             <wp:cNvGraphicFramePr>
               <a:graphicFrameLocks xmlns:a="http://schemas.openxmlformats.org/drawingml/2006/main" noChangeAspect="1"/>
             </wp:cNvGraphicFramePr>
@@ -81,7 +72,7 @@
                   <pic:spPr>
                     <a:xfrm>
                       <a:off x="0" y="0"/>
-                      <a:ext cx="5612130" cy="2590165"/>
+                      <a:ext cx="5612130" cy="2854960"/>
                     </a:xfrm>
                     <a:prstGeom prst="rect">
                       <a:avLst/>
@@ -95,11 +86,215 @@
       </w:r>
     </w:p>
     <w:p>
-      <w:pPr>
-        <w:ind w:left="708" w:hanging="708"/>
-      </w:pPr>
       <w:r>
-        <w:t>Lo intente</w:t>
+        <w:lastRenderedPageBreak/>
+        <w:drawing>
+          <wp:inline distT="0" distB="0" distL="0" distR="0" wp14:anchorId="3FC0A63A" wp14:editId="38F75C8A">
+            <wp:extent cx="5612130" cy="3057525"/>
+            <wp:effectExtent l="0" t="0" r="7620" b="9525"/>
+            <wp:docPr id="9" name="Imagen 9"/>
+            <wp:cNvGraphicFramePr>
+              <a:graphicFrameLocks xmlns:a="http://schemas.openxmlformats.org/drawingml/2006/main" noChangeAspect="1"/>
+            </wp:cNvGraphicFramePr>
+            <a:graphic xmlns:a="http://schemas.openxmlformats.org/drawingml/2006/main">
+              <a:graphicData uri="http://schemas.openxmlformats.org/drawingml/2006/picture">
+                <pic:pic xmlns:pic="http://schemas.openxmlformats.org/drawingml/2006/picture">
+                  <pic:nvPicPr>
+                    <pic:cNvPr id="1" name=""/>
+                    <pic:cNvPicPr/>
+                  </pic:nvPicPr>
+                  <pic:blipFill>
+                    <a:blip r:embed="rId6"/>
+                    <a:stretch>
+                      <a:fillRect/>
+                    </a:stretch>
+                  </pic:blipFill>
+                  <pic:spPr>
+                    <a:xfrm>
+                      <a:off x="0" y="0"/>
+                      <a:ext cx="5612130" cy="3057525"/>
+                    </a:xfrm>
+                    <a:prstGeom prst="rect">
+                      <a:avLst/>
+                    </a:prstGeom>
+                  </pic:spPr>
+                </pic:pic>
+              </a:graphicData>
+            </a:graphic>
+          </wp:inline>
+        </w:drawing>
+      </w:r>
+    </w:p>
+    <w:p>
+      <w:r>
+        <w:drawing>
+          <wp:inline distT="0" distB="0" distL="0" distR="0" wp14:anchorId="1C64512F" wp14:editId="5C355010">
+            <wp:extent cx="5612130" cy="2592070"/>
+            <wp:effectExtent l="0" t="0" r="7620" b="0"/>
+            <wp:docPr id="10" name="Imagen 10"/>
+            <wp:cNvGraphicFramePr>
+              <a:graphicFrameLocks xmlns:a="http://schemas.openxmlformats.org/drawingml/2006/main" noChangeAspect="1"/>
+            </wp:cNvGraphicFramePr>
+            <a:graphic xmlns:a="http://schemas.openxmlformats.org/drawingml/2006/main">
+              <a:graphicData uri="http://schemas.openxmlformats.org/drawingml/2006/picture">
+                <pic:pic xmlns:pic="http://schemas.openxmlformats.org/drawingml/2006/picture">
+                  <pic:nvPicPr>
+                    <pic:cNvPr id="1" name=""/>
+                    <pic:cNvPicPr/>
+                  </pic:nvPicPr>
+                  <pic:blipFill>
+                    <a:blip r:embed="rId7"/>
+                    <a:stretch>
+                      <a:fillRect/>
+                    </a:stretch>
+                  </pic:blipFill>
+                  <pic:spPr>
+                    <a:xfrm>
+                      <a:off x="0" y="0"/>
+                      <a:ext cx="5612130" cy="2592070"/>
+                    </a:xfrm>
+                    <a:prstGeom prst="rect">
+                      <a:avLst/>
+                    </a:prstGeom>
+                  </pic:spPr>
+                </pic:pic>
+              </a:graphicData>
+            </a:graphic>
+          </wp:inline>
+        </w:drawing>
+      </w:r>
+    </w:p>
+    <w:p>
+      <w:r>
+        <w:t xml:space="preserve">Secrets de </w:t>
+      </w:r>
+      <w:r>
+        <w:t>en el Git hub</w:t>
+      </w:r>
+    </w:p>
+    <w:p>
+      <w:r>
+        <w:lastRenderedPageBreak/>
+        <w:drawing>
+          <wp:inline distT="0" distB="0" distL="0" distR="0" wp14:anchorId="7896F020" wp14:editId="243FCB80">
+            <wp:extent cx="5612130" cy="2749550"/>
+            <wp:effectExtent l="0" t="0" r="7620" b="0"/>
+            <wp:docPr id="1" name="Imagen 1"/>
+            <wp:cNvGraphicFramePr>
+              <a:graphicFrameLocks xmlns:a="http://schemas.openxmlformats.org/drawingml/2006/main" noChangeAspect="1"/>
+            </wp:cNvGraphicFramePr>
+            <a:graphic xmlns:a="http://schemas.openxmlformats.org/drawingml/2006/main">
+              <a:graphicData uri="http://schemas.openxmlformats.org/drawingml/2006/picture">
+                <pic:pic xmlns:pic="http://schemas.openxmlformats.org/drawingml/2006/picture">
+                  <pic:nvPicPr>
+                    <pic:cNvPr id="1" name=""/>
+                    <pic:cNvPicPr/>
+                  </pic:nvPicPr>
+                  <pic:blipFill>
+                    <a:blip r:embed="rId8"/>
+                    <a:stretch>
+                      <a:fillRect/>
+                    </a:stretch>
+                  </pic:blipFill>
+                  <pic:spPr>
+                    <a:xfrm>
+                      <a:off x="0" y="0"/>
+                      <a:ext cx="5612130" cy="2749550"/>
+                    </a:xfrm>
+                    <a:prstGeom prst="rect">
+                      <a:avLst/>
+                    </a:prstGeom>
+                  </pic:spPr>
+                </pic:pic>
+              </a:graphicData>
+            </a:graphic>
+          </wp:inline>
+        </w:drawing>
+      </w:r>
+    </w:p>
+    <w:p>
+      <w:r>
+        <w:drawing>
+          <wp:inline distT="0" distB="0" distL="0" distR="0" wp14:anchorId="1ADB5168" wp14:editId="38F75A60">
+            <wp:extent cx="5612130" cy="2785745"/>
+            <wp:effectExtent l="0" t="0" r="7620" b="0"/>
+            <wp:docPr id="5" name="Imagen 5"/>
+            <wp:cNvGraphicFramePr>
+              <a:graphicFrameLocks xmlns:a="http://schemas.openxmlformats.org/drawingml/2006/main" noChangeAspect="1"/>
+            </wp:cNvGraphicFramePr>
+            <a:graphic xmlns:a="http://schemas.openxmlformats.org/drawingml/2006/main">
+              <a:graphicData uri="http://schemas.openxmlformats.org/drawingml/2006/picture">
+                <pic:pic xmlns:pic="http://schemas.openxmlformats.org/drawingml/2006/picture">
+                  <pic:nvPicPr>
+                    <pic:cNvPr id="1" name=""/>
+                    <pic:cNvPicPr/>
+                  </pic:nvPicPr>
+                  <pic:blipFill>
+                    <a:blip r:embed="rId9"/>
+                    <a:stretch>
+                      <a:fillRect/>
+                    </a:stretch>
+                  </pic:blipFill>
+                  <pic:spPr>
+                    <a:xfrm>
+                      <a:off x="0" y="0"/>
+                      <a:ext cx="5612130" cy="2785745"/>
+                    </a:xfrm>
+                    <a:prstGeom prst="rect">
+                      <a:avLst/>
+                    </a:prstGeom>
+                  </pic:spPr>
+                </pic:pic>
+              </a:graphicData>
+            </a:graphic>
+          </wp:inline>
+        </w:drawing>
+      </w:r>
+    </w:p>
+    <w:p/>
+    <w:p>
+      <w:r>
+        <w:t xml:space="preserve">Evidencias para el Postman </w:t>
+      </w:r>
+    </w:p>
+    <w:p>
+      <w:r>
+        <w:lastRenderedPageBreak/>
+        <w:drawing>
+          <wp:inline distT="0" distB="0" distL="0" distR="0" wp14:anchorId="6C307F88" wp14:editId="52C3A198">
+            <wp:extent cx="5612130" cy="3500120"/>
+            <wp:effectExtent l="0" t="0" r="7620" b="5080"/>
+            <wp:docPr id="6" name="Imagen 6"/>
+            <wp:cNvGraphicFramePr>
+              <a:graphicFrameLocks xmlns:a="http://schemas.openxmlformats.org/drawingml/2006/main" noChangeAspect="1"/>
+            </wp:cNvGraphicFramePr>
+            <a:graphic xmlns:a="http://schemas.openxmlformats.org/drawingml/2006/main">
+              <a:graphicData uri="http://schemas.openxmlformats.org/drawingml/2006/picture">
+                <pic:pic xmlns:pic="http://schemas.openxmlformats.org/drawingml/2006/picture">
+                  <pic:nvPicPr>
+                    <pic:cNvPr id="1" name=""/>
+                    <pic:cNvPicPr/>
+                  </pic:nvPicPr>
+                  <pic:blipFill>
+                    <a:blip r:embed="rId10"/>
+                    <a:stretch>
+                      <a:fillRect/>
+                    </a:stretch>
+                  </pic:blipFill>
+                  <pic:spPr>
+                    <a:xfrm>
+                      <a:off x="0" y="0"/>
+                      <a:ext cx="5612130" cy="3500120"/>
+                    </a:xfrm>
+                    <a:prstGeom prst="rect">
+                      <a:avLst/>
+                    </a:prstGeom>
+                  </pic:spPr>
+                </pic:pic>
+              </a:graphicData>
+            </a:graphic>
+          </wp:inline>
+        </w:drawing>
       </w:r>
     </w:p>
     <w:sectPr>

</xml_diff>